<commit_message>
Updated to intro to follow new CMEI guidelines
</commit_message>
<xml_diff>
--- a/Report/Introduction.docx
+++ b/Report/Introduction.docx
@@ -11,8 +11,8 @@
           <w:noProof/>
         </w:rPr>
         <w:drawing>
-          <wp:inline distT="0" distB="0" distL="0" distR="0" wp14:anchorId="448321D7" wp14:editId="728C89F9">
-            <wp:extent cx="4114800" cy="894969"/>
+          <wp:inline distT="0" distB="0" distL="0" distR="0" wp14:anchorId="448321D7" wp14:editId="748F55F1">
+            <wp:extent cx="4120055" cy="896112"/>
             <wp:effectExtent l="0" t="0" r="0" b="0"/>
             <wp:docPr id="1998644167" name="Picture 1" descr="A close up of a logo&#10;&#10;Description automatically generated"/>
             <wp:cNvGraphicFramePr>
@@ -40,7 +40,7 @@
                   <pic:spPr>
                     <a:xfrm>
                       <a:off x="0" y="0"/>
-                      <a:ext cx="4114800" cy="894969"/>
+                      <a:ext cx="4120055" cy="896112"/>
                     </a:xfrm>
                     <a:prstGeom prst="rect">
                       <a:avLst/>
@@ -59,26 +59,10 @@
         <w:jc w:val="center"/>
         <w:rPr>
           <w:b/>
-          <w:sz w:val="39"/>
-          <w:szCs w:val="39"/>
-        </w:rPr>
-      </w:pPr>
-      <w:r>
-        <w:rPr>
-          <w:b/>
-          <w:sz w:val="39"/>
-          <w:szCs w:val="39"/>
-        </w:rPr>
-        <w:t xml:space="preserve">INDUSTRIAL </w:t>
-      </w:r>
-      <w:r>
-        <w:rPr>
-          <w:b/>
-          <w:sz w:val="39"/>
-          <w:szCs w:val="39"/>
-        </w:rPr>
-        <w:t xml:space="preserve">TRAINING AND </w:t>
-      </w:r>
+          <w:sz w:val="36"/>
+          <w:szCs w:val="36"/>
+        </w:rPr>
+      </w:pPr>
     </w:p>
     <w:p>
       <w:pPr>
@@ -86,24 +70,40 @@
         <w:jc w:val="center"/>
         <w:rPr>
           <w:b/>
-          <w:sz w:val="39"/>
-          <w:szCs w:val="39"/>
+          <w:sz w:val="36"/>
+          <w:szCs w:val="36"/>
         </w:rPr>
       </w:pPr>
       <w:r>
         <w:rPr>
           <w:b/>
-          <w:sz w:val="39"/>
-          <w:szCs w:val="39"/>
-        </w:rPr>
-        <w:t>ASSESSMENT CENTER REPORT</w:t>
+          <w:sz w:val="36"/>
+          <w:szCs w:val="36"/>
+        </w:rPr>
+        <w:t xml:space="preserve">INDUSTRIAL </w:t>
+      </w:r>
+      <w:r>
+        <w:rPr>
+          <w:b/>
+          <w:sz w:val="36"/>
+          <w:szCs w:val="36"/>
+        </w:rPr>
+        <w:t xml:space="preserve">TRAINING AND </w:t>
       </w:r>
     </w:p>
     <w:p>
       <w:pPr>
-        <w:spacing w:before="240" w:after="240" w:line="276" w:lineRule="auto"/>
+        <w:spacing w:line="276" w:lineRule="auto"/>
         <w:jc w:val="center"/>
       </w:pPr>
+      <w:r>
+        <w:rPr>
+          <w:b/>
+          <w:sz w:val="36"/>
+          <w:szCs w:val="36"/>
+        </w:rPr>
+        <w:t>ASSESSMENT CENTER REPORT</w:t>
+      </w:r>
       <w:r>
         <w:rPr>
           <w:noProof/>
@@ -111,7 +111,7 @@
           <w:bdr w:val="none" w:sz="0" w:space="0" w:color="auto" w:frame="1"/>
         </w:rPr>
         <w:drawing>
-          <wp:inline distT="0" distB="0" distL="0" distR="0" wp14:anchorId="6D2EF38D" wp14:editId="79CDF6B9">
+          <wp:inline distT="0" distB="0" distL="0" distR="0" wp14:anchorId="6D2EF38D" wp14:editId="59E6D816">
             <wp:extent cx="2753047" cy="1400175"/>
             <wp:effectExtent l="0" t="0" r="0" b="0"/>
             <wp:docPr id="514653375" name="Picture 1" descr="Industrial Training and Assessment Centers | Department of Energy"/>
@@ -128,7 +128,7 @@
                     </pic:cNvPicPr>
                   </pic:nvPicPr>
                   <pic:blipFill>
-                    <a:blip r:embed="rId9">
+                    <a:blip r:embed="rId9" cstate="print">
                       <a:extLst>
                         <a:ext uri="{28A0092B-C50C-407E-A947-70E740481C1C}">
                           <a14:useLocalDpi xmlns:a14="http://schemas.microsoft.com/office/drawing/2010/main" val="0"/>
@@ -143,7 +143,7 @@
                   <pic:spPr bwMode="auto">
                     <a:xfrm>
                       <a:off x="0" y="0"/>
-                      <a:ext cx="2778815" cy="1413280"/>
+                      <a:ext cx="2753047" cy="1400175"/>
                     </a:xfrm>
                     <a:prstGeom prst="rect">
                       <a:avLst/>
@@ -320,23 +320,55 @@
           <w:b/>
           <w:bCs/>
         </w:rPr>
-        <w:t>OFFICE OF MANUFACTURING AND ENERGY SUPPLY CHAINS (MESC)</w:t>
+        <w:t xml:space="preserve">OFFICE OF </w:t>
+      </w:r>
+      <w:r>
+        <w:rPr>
+          <w:b/>
+          <w:bCs/>
+        </w:rPr>
+        <w:t>CRITICAL MINERALS AND ENERGY INNOVATION</w:t>
+      </w:r>
+      <w:r>
+        <w:rPr>
+          <w:b/>
+          <w:bCs/>
+        </w:rPr>
+        <w:t xml:space="preserve"> (</w:t>
+      </w:r>
+      <w:r>
+        <w:rPr>
+          <w:b/>
+          <w:bCs/>
+        </w:rPr>
+        <w:t>CMEI</w:t>
+      </w:r>
+      <w:r>
+        <w:rPr>
+          <w:b/>
+          <w:bCs/>
+        </w:rPr>
+        <w:t>)</w:t>
       </w:r>
     </w:p>
     <w:p>
       <w:pPr>
-        <w:spacing w:before="240" w:after="240" w:line="276" w:lineRule="auto"/>
+        <w:spacing w:line="276" w:lineRule="auto"/>
         <w:jc w:val="center"/>
+        <w:rPr>
+          <w:b/>
+          <w:bCs/>
+        </w:rPr>
       </w:pPr>
       <w:r>
         <w:rPr>
           <w:noProof/>
         </w:rPr>
         <w:drawing>
-          <wp:inline distT="0" distB="0" distL="0" distR="0" wp14:anchorId="20B162A8" wp14:editId="2D060990">
-            <wp:extent cx="4114800" cy="1038987"/>
-            <wp:effectExtent l="0" t="0" r="0" b="2540"/>
-            <wp:docPr id="3" name="image4.png" descr="A picture containing text, clipart&#10;&#10;Description automatically generated"/>
+          <wp:inline distT="0" distB="0" distL="0" distR="0" wp14:anchorId="71E481BD" wp14:editId="07D0E935">
+            <wp:extent cx="1600200" cy="1600200"/>
+            <wp:effectExtent l="0" t="0" r="0" b="0"/>
+            <wp:docPr id="163397250" name="Picture 1" descr="CMEI&#10;&#10;AI-generated content may be incorrect."/>
             <wp:cNvGraphicFramePr>
               <a:graphicFrameLocks xmlns:a="http://schemas.openxmlformats.org/drawingml/2006/main" noChangeAspect="1"/>
             </wp:cNvGraphicFramePr>
@@ -344,25 +376,36 @@
               <a:graphicData uri="http://schemas.openxmlformats.org/drawingml/2006/picture">
                 <pic:pic xmlns:pic="http://schemas.openxmlformats.org/drawingml/2006/picture">
                   <pic:nvPicPr>
-                    <pic:cNvPr id="0" name="image4.png" descr="A picture containing text, clipart&#10;&#10;Description automatically generated"/>
-                    <pic:cNvPicPr preferRelativeResize="0"/>
+                    <pic:cNvPr id="163397250" name="Picture 1" descr="CMEI&#10;&#10;AI-generated content may be incorrect."/>
+                    <pic:cNvPicPr>
+                      <a:picLocks noChangeAspect="1" noChangeArrowheads="1"/>
+                    </pic:cNvPicPr>
                   </pic:nvPicPr>
                   <pic:blipFill>
-                    <a:blip r:embed="rId10"/>
+                    <a:blip r:embed="rId10">
+                      <a:extLst>
+                        <a:ext uri="{28A0092B-C50C-407E-A947-70E740481C1C}">
+                          <a14:useLocalDpi xmlns:a14="http://schemas.microsoft.com/office/drawing/2010/main" val="0"/>
+                        </a:ext>
+                      </a:extLst>
+                    </a:blip>
                     <a:srcRect/>
                     <a:stretch>
                       <a:fillRect/>
                     </a:stretch>
                   </pic:blipFill>
-                  <pic:spPr>
+                  <pic:spPr bwMode="auto">
                     <a:xfrm>
                       <a:off x="0" y="0"/>
-                      <a:ext cx="4114800" cy="1038987"/>
+                      <a:ext cx="1600200" cy="1600200"/>
                     </a:xfrm>
                     <a:prstGeom prst="rect">
                       <a:avLst/>
                     </a:prstGeom>
-                    <a:ln/>
+                    <a:noFill/>
+                    <a:ln>
+                      <a:noFill/>
+                    </a:ln>
                   </pic:spPr>
                 </pic:pic>
               </a:graphicData>
@@ -729,44 +772,16 @@
         <w:jc w:val="center"/>
       </w:pPr>
       <w:r>
-        <w:t xml:space="preserve">Muhannad </w:t>
+        <w:t>Amin Balazadeh</w:t>
+      </w:r>
+      <w:r>
+        <w:t xml:space="preserve"> </w:t>
       </w:r>
       <w:proofErr w:type="spellStart"/>
       <w:r>
-        <w:t>Altimemy</w:t>
+        <w:t>Kouchech</w:t>
       </w:r>
       <w:proofErr w:type="spellEnd"/>
-    </w:p>
-    <w:p>
-      <w:pPr>
-        <w:spacing w:line="276" w:lineRule="auto"/>
-        <w:jc w:val="center"/>
-      </w:pPr>
-      <w:r>
-        <w:t xml:space="preserve">Amin </w:t>
-      </w:r>
-      <w:proofErr w:type="spellStart"/>
-      <w:r>
-        <w:t>Balazadeh</w:t>
-      </w:r>
-      <w:proofErr w:type="spellEnd"/>
-      <w:r>
-        <w:t xml:space="preserve"> </w:t>
-      </w:r>
-      <w:proofErr w:type="spellStart"/>
-      <w:r>
-        <w:t>Kouchech</w:t>
-      </w:r>
-      <w:proofErr w:type="spellEnd"/>
-    </w:p>
-    <w:p>
-      <w:pPr>
-        <w:spacing w:line="276" w:lineRule="auto"/>
-        <w:jc w:val="center"/>
-      </w:pPr>
-      <w:r>
-        <w:t>Genevieve Dare</w:t>
-      </w:r>
     </w:p>
     <w:p>
       <w:pPr>
@@ -939,7 +954,7 @@
         <w:t>The contents of this report are offered as guidance. The U. S. Department of Energy, Rutgers, The State University of New Jersey, Lehigh University, and all technical sources referenced in this report do not: (a) make any warranty or representation, expressed or implied, with respect to the accuracy, completeness, or usefulness of the information contained in this report, or that the use of any information, apparatus, method, or process disclosed in this report may not infringe on privately owned rights, (b) assume any liabilities with respect to the use of, or for damages resulting from the use of, any information, apparatus, method or process disclosed in this report. This report does not reflect official views or policy of the above-mentioned institutions. Mention of trade names or commercial products does not constitute endorsement or recommendation of use.</w:t>
       </w:r>
       <w:r>
-        <w:t xml:space="preserve">                                              </w:t>
+        <w:t xml:space="preserve"> No artificial intelligence (AI) was used to generate this report.</w:t>
       </w:r>
     </w:p>
     <w:p>
@@ -1205,6 +1220,9 @@
             <w:r>
               <w:t>Electricity</w:t>
             </w:r>
+            <w:r>
+              <w:t xml:space="preserve"> Usage</w:t>
+            </w:r>
           </w:p>
         </w:tc>
         <w:tc>
@@ -1244,23 +1262,6 @@
             </w:r>
             <w:r>
               <w:t xml:space="preserve"> MMBtu</w:t>
-            </w:r>
-          </w:p>
-          <w:p>
-            <w:pPr>
-              <w:spacing w:before="60" w:after="60" w:line="276" w:lineRule="auto"/>
-              <w:jc w:val="center"/>
-            </w:pPr>
-            <w:r>
-              <w:t>${</w:t>
-            </w:r>
-            <w:proofErr w:type="spellStart"/>
-            <w:r>
-              <w:t>TotalDkW</w:t>
-            </w:r>
-            <w:proofErr w:type="spellEnd"/>
-            <w:r>
-              <w:t>} kW</w:t>
             </w:r>
           </w:p>
         </w:tc>
@@ -1288,6 +1289,61 @@
             <w:r>
               <w:t xml:space="preserve">} </w:t>
             </w:r>
+          </w:p>
+        </w:tc>
+      </w:tr>
+      <w:tr>
+        <w:trPr>
+          <w:jc w:val="center"/>
+        </w:trPr>
+        <w:tc>
+          <w:tcPr>
+            <w:tcW w:w="1728" w:type="dxa"/>
+            <w:vAlign w:val="center"/>
+          </w:tcPr>
+          <w:p>
+            <w:pPr>
+              <w:spacing w:before="60" w:after="60" w:line="276" w:lineRule="auto"/>
+              <w:jc w:val="center"/>
+            </w:pPr>
+            <w:r>
+              <w:t>Electricity Demand Usage</w:t>
+            </w:r>
+          </w:p>
+        </w:tc>
+        <w:tc>
+          <w:tcPr>
+            <w:tcW w:w="5184" w:type="dxa"/>
+            <w:vAlign w:val="center"/>
+          </w:tcPr>
+          <w:p>
+            <w:pPr>
+              <w:spacing w:before="60" w:after="60" w:line="276" w:lineRule="auto"/>
+              <w:jc w:val="center"/>
+            </w:pPr>
+            <w:r>
+              <w:t>${</w:t>
+            </w:r>
+            <w:proofErr w:type="spellStart"/>
+            <w:r>
+              <w:t>TotalDkW</w:t>
+            </w:r>
+            <w:proofErr w:type="spellEnd"/>
+            <w:r>
+              <w:t>} kW</w:t>
+            </w:r>
+          </w:p>
+        </w:tc>
+        <w:tc>
+          <w:tcPr>
+            <w:tcW w:w="1728" w:type="dxa"/>
+            <w:vAlign w:val="center"/>
+          </w:tcPr>
+          <w:p>
+            <w:pPr>
+              <w:spacing w:before="60" w:after="60" w:line="276" w:lineRule="auto"/>
+              <w:jc w:val="right"/>
+            </w:pPr>
           </w:p>
         </w:tc>
       </w:tr>
@@ -2083,6 +2139,7 @@
                 <w:b/>
                 <w:bCs/>
               </w:rPr>
+              <w:lastRenderedPageBreak/>
               <w:t xml:space="preserve">Total Annual </w:t>
             </w:r>
             <w:r>
@@ -2176,7 +2233,6 @@
                 <w:b/>
                 <w:bCs/>
               </w:rPr>
-              <w:lastRenderedPageBreak/>
               <w:t>$</w:t>
             </w:r>
             <w:r>
@@ -2320,34 +2376,47 @@
           <w:noProof/>
         </w:rPr>
         <w:drawing>
-          <wp:inline distT="0" distB="0" distL="0" distR="0" wp14:anchorId="5A90E78C" wp14:editId="040FC027">
-            <wp:extent cx="4133850" cy="1104900"/>
+          <wp:inline distT="0" distB="0" distL="0" distR="0" wp14:anchorId="3D48D187" wp14:editId="2D9B00D6">
+            <wp:extent cx="1600200" cy="1600200"/>
             <wp:effectExtent l="0" t="0" r="0" b="0"/>
-            <wp:docPr id="6" name="image8.png" descr="A picture containing text, clipart&#10;&#10;Description automatically generated"/>
-            <wp:cNvGraphicFramePr/>
+            <wp:docPr id="668017018" name="Picture 1" descr="CMEI&#10;&#10;AI-generated content may be incorrect."/>
+            <wp:cNvGraphicFramePr>
+              <a:graphicFrameLocks xmlns:a="http://schemas.openxmlformats.org/drawingml/2006/main" noChangeAspect="1"/>
+            </wp:cNvGraphicFramePr>
             <a:graphic xmlns:a="http://schemas.openxmlformats.org/drawingml/2006/main">
               <a:graphicData uri="http://schemas.openxmlformats.org/drawingml/2006/picture">
                 <pic:pic xmlns:pic="http://schemas.openxmlformats.org/drawingml/2006/picture">
                   <pic:nvPicPr>
-                    <pic:cNvPr id="0" name="image8.png" descr="A picture containing text, clipart&#10;&#10;Description automatically generated"/>
-                    <pic:cNvPicPr preferRelativeResize="0"/>
+                    <pic:cNvPr id="163397250" name="Picture 1" descr="CMEI&#10;&#10;AI-generated content may be incorrect."/>
+                    <pic:cNvPicPr>
+                      <a:picLocks noChangeAspect="1" noChangeArrowheads="1"/>
+                    </pic:cNvPicPr>
                   </pic:nvPicPr>
                   <pic:blipFill>
-                    <a:blip r:embed="rId12"/>
+                    <a:blip r:embed="rId10">
+                      <a:extLst>
+                        <a:ext uri="{28A0092B-C50C-407E-A947-70E740481C1C}">
+                          <a14:useLocalDpi xmlns:a14="http://schemas.microsoft.com/office/drawing/2010/main" val="0"/>
+                        </a:ext>
+                      </a:extLst>
+                    </a:blip>
                     <a:srcRect/>
                     <a:stretch>
                       <a:fillRect/>
                     </a:stretch>
                   </pic:blipFill>
-                  <pic:spPr>
+                  <pic:spPr bwMode="auto">
                     <a:xfrm>
                       <a:off x="0" y="0"/>
-                      <a:ext cx="4133850" cy="1104900"/>
+                      <a:ext cx="1600200" cy="1600200"/>
                     </a:xfrm>
                     <a:prstGeom prst="rect">
                       <a:avLst/>
                     </a:prstGeom>
-                    <a:ln/>
+                    <a:noFill/>
+                    <a:ln>
+                      <a:noFill/>
+                    </a:ln>
                   </pic:spPr>
                 </pic:pic>
               </a:graphicData>
@@ -2483,10 +2552,18 @@
         <w:t>}</w:t>
       </w:r>
       <w:r>
-        <w:t>, is given in Table 2.</w:t>
-      </w:r>
-      <w:r>
-        <w:t>&lt;/A</w:t>
+        <w:t xml:space="preserve">, is given in Table </w:t>
+      </w:r>
+      <w:proofErr w:type="gramStart"/>
+      <w:r>
+        <w:t>2.</w:t>
+      </w:r>
+      <w:r>
+        <w:t>&lt;</w:t>
+      </w:r>
+      <w:proofErr w:type="gramEnd"/>
+      <w:r>
+        <w:t>/A</w:t>
       </w:r>
       <w:r>
         <w:t>DD</w:t>
@@ -2725,7 +2802,6 @@
               <w:bottom w:val="single" w:sz="8" w:space="0" w:color="auto"/>
               <w:right w:val="single" w:sz="8" w:space="0" w:color="auto"/>
             </w:tcBorders>
-            <w:shd w:val="clear" w:color="auto" w:fill="auto"/>
             <w:vAlign w:val="center"/>
           </w:tcPr>
           <w:p>
@@ -2748,7 +2824,6 @@
               <w:bottom w:val="single" w:sz="8" w:space="0" w:color="auto"/>
               <w:right w:val="single" w:sz="8" w:space="0" w:color="auto"/>
             </w:tcBorders>
-            <w:shd w:val="clear" w:color="auto" w:fill="auto"/>
             <w:vAlign w:val="center"/>
           </w:tcPr>
           <w:p>
@@ -2771,7 +2846,6 @@
               <w:bottom w:val="single" w:sz="8" w:space="0" w:color="auto"/>
               <w:right w:val="single" w:sz="8" w:space="0" w:color="auto"/>
             </w:tcBorders>
-            <w:shd w:val="clear" w:color="auto" w:fill="auto"/>
             <w:vAlign w:val="center"/>
           </w:tcPr>
           <w:p>
@@ -2794,7 +2868,6 @@
               <w:bottom w:val="single" w:sz="8" w:space="0" w:color="auto"/>
               <w:right w:val="single" w:sz="8" w:space="0" w:color="auto"/>
             </w:tcBorders>
-            <w:shd w:val="clear" w:color="auto" w:fill="auto"/>
             <w:vAlign w:val="center"/>
           </w:tcPr>
           <w:p>
@@ -2817,7 +2890,6 @@
               <w:bottom w:val="single" w:sz="8" w:space="0" w:color="auto"/>
               <w:right w:val="single" w:sz="8" w:space="0" w:color="auto"/>
             </w:tcBorders>
-            <w:shd w:val="clear" w:color="auto" w:fill="auto"/>
             <w:vAlign w:val="center"/>
           </w:tcPr>
           <w:p>
@@ -2840,7 +2912,6 @@
               <w:bottom w:val="single" w:sz="8" w:space="0" w:color="auto"/>
               <w:right w:val="single" w:sz="8" w:space="0" w:color="auto"/>
             </w:tcBorders>
-            <w:shd w:val="clear" w:color="auto" w:fill="auto"/>
             <w:vAlign w:val="center"/>
           </w:tcPr>
           <w:p>
@@ -2863,7 +2934,6 @@
               <w:bottom w:val="single" w:sz="8" w:space="0" w:color="auto"/>
               <w:right w:val="single" w:sz="8" w:space="0" w:color="auto"/>
             </w:tcBorders>
-            <w:shd w:val="clear" w:color="auto" w:fill="auto"/>
             <w:vAlign w:val="center"/>
           </w:tcPr>
           <w:p>
@@ -2891,7 +2961,6 @@
               <w:bottom w:val="single" w:sz="8" w:space="0" w:color="auto"/>
               <w:right w:val="single" w:sz="8" w:space="0" w:color="auto"/>
             </w:tcBorders>
-            <w:shd w:val="clear" w:color="auto" w:fill="auto"/>
             <w:vAlign w:val="center"/>
           </w:tcPr>
           <w:p>
@@ -2914,7 +2983,6 @@
               <w:bottom w:val="single" w:sz="8" w:space="0" w:color="auto"/>
               <w:right w:val="single" w:sz="8" w:space="0" w:color="auto"/>
             </w:tcBorders>
-            <w:shd w:val="clear" w:color="auto" w:fill="auto"/>
             <w:vAlign w:val="center"/>
           </w:tcPr>
           <w:p>
@@ -2937,7 +3005,6 @@
               <w:bottom w:val="single" w:sz="8" w:space="0" w:color="auto"/>
               <w:right w:val="single" w:sz="8" w:space="0" w:color="auto"/>
             </w:tcBorders>
-            <w:shd w:val="clear" w:color="auto" w:fill="auto"/>
             <w:vAlign w:val="center"/>
           </w:tcPr>
           <w:p>
@@ -2960,7 +3027,6 @@
               <w:bottom w:val="single" w:sz="8" w:space="0" w:color="auto"/>
               <w:right w:val="single" w:sz="8" w:space="0" w:color="auto"/>
             </w:tcBorders>
-            <w:shd w:val="clear" w:color="auto" w:fill="auto"/>
             <w:vAlign w:val="center"/>
           </w:tcPr>
           <w:p>
@@ -2983,7 +3049,6 @@
               <w:bottom w:val="single" w:sz="8" w:space="0" w:color="auto"/>
               <w:right w:val="single" w:sz="8" w:space="0" w:color="auto"/>
             </w:tcBorders>
-            <w:shd w:val="clear" w:color="auto" w:fill="auto"/>
             <w:vAlign w:val="center"/>
           </w:tcPr>
           <w:p>
@@ -3006,7 +3071,6 @@
               <w:bottom w:val="single" w:sz="8" w:space="0" w:color="auto"/>
               <w:right w:val="single" w:sz="8" w:space="0" w:color="auto"/>
             </w:tcBorders>
-            <w:shd w:val="clear" w:color="auto" w:fill="auto"/>
             <w:vAlign w:val="center"/>
           </w:tcPr>
           <w:p>
@@ -3029,7 +3093,6 @@
               <w:bottom w:val="single" w:sz="8" w:space="0" w:color="auto"/>
               <w:right w:val="single" w:sz="8" w:space="0" w:color="auto"/>
             </w:tcBorders>
-            <w:shd w:val="clear" w:color="auto" w:fill="auto"/>
             <w:vAlign w:val="center"/>
           </w:tcPr>
           <w:p>
@@ -3057,7 +3120,6 @@
               <w:bottom w:val="single" w:sz="8" w:space="0" w:color="auto"/>
               <w:right w:val="single" w:sz="8" w:space="0" w:color="auto"/>
             </w:tcBorders>
-            <w:shd w:val="clear" w:color="auto" w:fill="auto"/>
             <w:vAlign w:val="center"/>
           </w:tcPr>
           <w:p>
@@ -3080,7 +3142,6 @@
               <w:bottom w:val="single" w:sz="8" w:space="0" w:color="auto"/>
               <w:right w:val="single" w:sz="8" w:space="0" w:color="auto"/>
             </w:tcBorders>
-            <w:shd w:val="clear" w:color="auto" w:fill="auto"/>
             <w:vAlign w:val="center"/>
           </w:tcPr>
           <w:p>
@@ -3103,7 +3164,6 @@
               <w:bottom w:val="single" w:sz="8" w:space="0" w:color="auto"/>
               <w:right w:val="single" w:sz="8" w:space="0" w:color="auto"/>
             </w:tcBorders>
-            <w:shd w:val="clear" w:color="auto" w:fill="auto"/>
             <w:vAlign w:val="center"/>
           </w:tcPr>
           <w:p>
@@ -3126,7 +3186,6 @@
               <w:bottom w:val="single" w:sz="8" w:space="0" w:color="auto"/>
               <w:right w:val="single" w:sz="8" w:space="0" w:color="auto"/>
             </w:tcBorders>
-            <w:shd w:val="clear" w:color="auto" w:fill="auto"/>
             <w:vAlign w:val="center"/>
           </w:tcPr>
           <w:p>
@@ -3149,7 +3208,6 @@
               <w:bottom w:val="single" w:sz="8" w:space="0" w:color="auto"/>
               <w:right w:val="single" w:sz="8" w:space="0" w:color="auto"/>
             </w:tcBorders>
-            <w:shd w:val="clear" w:color="auto" w:fill="auto"/>
             <w:vAlign w:val="center"/>
           </w:tcPr>
           <w:p>
@@ -3172,7 +3230,6 @@
               <w:bottom w:val="single" w:sz="8" w:space="0" w:color="auto"/>
               <w:right w:val="single" w:sz="8" w:space="0" w:color="auto"/>
             </w:tcBorders>
-            <w:shd w:val="clear" w:color="auto" w:fill="auto"/>
             <w:vAlign w:val="center"/>
           </w:tcPr>
           <w:p>
@@ -3195,7 +3252,6 @@
               <w:bottom w:val="single" w:sz="8" w:space="0" w:color="auto"/>
               <w:right w:val="single" w:sz="8" w:space="0" w:color="auto"/>
             </w:tcBorders>
-            <w:shd w:val="clear" w:color="auto" w:fill="auto"/>
             <w:vAlign w:val="center"/>
           </w:tcPr>
           <w:p>
@@ -3223,7 +3279,6 @@
               <w:bottom w:val="single" w:sz="8" w:space="0" w:color="auto"/>
               <w:right w:val="single" w:sz="8" w:space="0" w:color="auto"/>
             </w:tcBorders>
-            <w:shd w:val="clear" w:color="auto" w:fill="auto"/>
             <w:vAlign w:val="center"/>
           </w:tcPr>
           <w:p>
@@ -3246,7 +3301,6 @@
               <w:bottom w:val="single" w:sz="8" w:space="0" w:color="auto"/>
               <w:right w:val="single" w:sz="8" w:space="0" w:color="auto"/>
             </w:tcBorders>
-            <w:shd w:val="clear" w:color="auto" w:fill="auto"/>
             <w:vAlign w:val="center"/>
           </w:tcPr>
           <w:p>
@@ -3269,7 +3323,6 @@
               <w:bottom w:val="single" w:sz="8" w:space="0" w:color="auto"/>
               <w:right w:val="single" w:sz="8" w:space="0" w:color="auto"/>
             </w:tcBorders>
-            <w:shd w:val="clear" w:color="auto" w:fill="auto"/>
             <w:vAlign w:val="center"/>
           </w:tcPr>
           <w:p>
@@ -3292,7 +3345,6 @@
               <w:bottom w:val="single" w:sz="8" w:space="0" w:color="auto"/>
               <w:right w:val="single" w:sz="8" w:space="0" w:color="auto"/>
             </w:tcBorders>
-            <w:shd w:val="clear" w:color="auto" w:fill="auto"/>
             <w:vAlign w:val="center"/>
           </w:tcPr>
           <w:p>
@@ -3315,7 +3367,6 @@
               <w:bottom w:val="single" w:sz="8" w:space="0" w:color="auto"/>
               <w:right w:val="single" w:sz="8" w:space="0" w:color="auto"/>
             </w:tcBorders>
-            <w:shd w:val="clear" w:color="auto" w:fill="auto"/>
             <w:vAlign w:val="center"/>
           </w:tcPr>
           <w:p>
@@ -3338,7 +3389,6 @@
               <w:bottom w:val="single" w:sz="8" w:space="0" w:color="auto"/>
               <w:right w:val="single" w:sz="8" w:space="0" w:color="auto"/>
             </w:tcBorders>
-            <w:shd w:val="clear" w:color="auto" w:fill="auto"/>
             <w:vAlign w:val="center"/>
           </w:tcPr>
           <w:p>
@@ -3361,7 +3411,6 @@
               <w:bottom w:val="single" w:sz="8" w:space="0" w:color="auto"/>
               <w:right w:val="single" w:sz="8" w:space="0" w:color="auto"/>
             </w:tcBorders>
-            <w:shd w:val="clear" w:color="auto" w:fill="auto"/>
             <w:vAlign w:val="center"/>
           </w:tcPr>
           <w:p>
@@ -3389,7 +3438,6 @@
               <w:bottom w:val="single" w:sz="8" w:space="0" w:color="auto"/>
               <w:right w:val="single" w:sz="8" w:space="0" w:color="auto"/>
             </w:tcBorders>
-            <w:shd w:val="clear" w:color="auto" w:fill="auto"/>
             <w:vAlign w:val="center"/>
           </w:tcPr>
           <w:p>
@@ -3412,7 +3460,6 @@
               <w:bottom w:val="single" w:sz="8" w:space="0" w:color="auto"/>
               <w:right w:val="single" w:sz="8" w:space="0" w:color="auto"/>
             </w:tcBorders>
-            <w:shd w:val="clear" w:color="auto" w:fill="auto"/>
             <w:vAlign w:val="center"/>
           </w:tcPr>
           <w:p>
@@ -3435,7 +3482,6 @@
               <w:bottom w:val="single" w:sz="8" w:space="0" w:color="auto"/>
               <w:right w:val="single" w:sz="8" w:space="0" w:color="auto"/>
             </w:tcBorders>
-            <w:shd w:val="clear" w:color="auto" w:fill="auto"/>
             <w:vAlign w:val="center"/>
           </w:tcPr>
           <w:p>
@@ -3458,7 +3504,6 @@
               <w:bottom w:val="single" w:sz="8" w:space="0" w:color="auto"/>
               <w:right w:val="single" w:sz="8" w:space="0" w:color="auto"/>
             </w:tcBorders>
-            <w:shd w:val="clear" w:color="auto" w:fill="auto"/>
             <w:vAlign w:val="center"/>
           </w:tcPr>
           <w:p>
@@ -3481,7 +3526,6 @@
               <w:bottom w:val="single" w:sz="8" w:space="0" w:color="auto"/>
               <w:right w:val="single" w:sz="8" w:space="0" w:color="auto"/>
             </w:tcBorders>
-            <w:shd w:val="clear" w:color="auto" w:fill="auto"/>
             <w:vAlign w:val="center"/>
           </w:tcPr>
           <w:p>
@@ -3504,7 +3548,6 @@
               <w:bottom w:val="single" w:sz="8" w:space="0" w:color="auto"/>
               <w:right w:val="single" w:sz="8" w:space="0" w:color="auto"/>
             </w:tcBorders>
-            <w:shd w:val="clear" w:color="auto" w:fill="auto"/>
             <w:vAlign w:val="center"/>
           </w:tcPr>
           <w:p>
@@ -3527,7 +3570,6 @@
               <w:bottom w:val="single" w:sz="8" w:space="0" w:color="auto"/>
               <w:right w:val="single" w:sz="8" w:space="0" w:color="auto"/>
             </w:tcBorders>
-            <w:shd w:val="clear" w:color="auto" w:fill="auto"/>
             <w:vAlign w:val="center"/>
           </w:tcPr>
           <w:p>
@@ -3555,7 +3597,6 @@
               <w:bottom w:val="single" w:sz="8" w:space="0" w:color="auto"/>
               <w:right w:val="single" w:sz="8" w:space="0" w:color="auto"/>
             </w:tcBorders>
-            <w:shd w:val="clear" w:color="auto" w:fill="auto"/>
             <w:vAlign w:val="center"/>
           </w:tcPr>
           <w:p>
@@ -3578,7 +3619,6 @@
               <w:bottom w:val="single" w:sz="8" w:space="0" w:color="auto"/>
               <w:right w:val="single" w:sz="8" w:space="0" w:color="auto"/>
             </w:tcBorders>
-            <w:shd w:val="clear" w:color="auto" w:fill="auto"/>
             <w:vAlign w:val="center"/>
           </w:tcPr>
           <w:p>
@@ -3601,7 +3641,6 @@
               <w:bottom w:val="single" w:sz="8" w:space="0" w:color="auto"/>
               <w:right w:val="single" w:sz="8" w:space="0" w:color="auto"/>
             </w:tcBorders>
-            <w:shd w:val="clear" w:color="auto" w:fill="auto"/>
             <w:vAlign w:val="center"/>
           </w:tcPr>
           <w:p>
@@ -3624,7 +3663,6 @@
               <w:bottom w:val="single" w:sz="8" w:space="0" w:color="auto"/>
               <w:right w:val="single" w:sz="8" w:space="0" w:color="auto"/>
             </w:tcBorders>
-            <w:shd w:val="clear" w:color="auto" w:fill="auto"/>
             <w:vAlign w:val="center"/>
           </w:tcPr>
           <w:p>
@@ -3647,7 +3685,6 @@
               <w:bottom w:val="single" w:sz="8" w:space="0" w:color="auto"/>
               <w:right w:val="single" w:sz="8" w:space="0" w:color="auto"/>
             </w:tcBorders>
-            <w:shd w:val="clear" w:color="auto" w:fill="auto"/>
             <w:vAlign w:val="center"/>
           </w:tcPr>
           <w:p>
@@ -3670,7 +3707,6 @@
               <w:bottom w:val="single" w:sz="8" w:space="0" w:color="auto"/>
               <w:right w:val="single" w:sz="8" w:space="0" w:color="auto"/>
             </w:tcBorders>
-            <w:shd w:val="clear" w:color="auto" w:fill="auto"/>
             <w:vAlign w:val="center"/>
           </w:tcPr>
           <w:p>
@@ -3693,7 +3729,6 @@
               <w:bottom w:val="single" w:sz="8" w:space="0" w:color="auto"/>
               <w:right w:val="single" w:sz="8" w:space="0" w:color="auto"/>
             </w:tcBorders>
-            <w:shd w:val="clear" w:color="auto" w:fill="auto"/>
             <w:vAlign w:val="center"/>
           </w:tcPr>
           <w:p>
@@ -3721,7 +3756,6 @@
               <w:bottom w:val="single" w:sz="8" w:space="0" w:color="auto"/>
               <w:right w:val="single" w:sz="8" w:space="0" w:color="auto"/>
             </w:tcBorders>
-            <w:shd w:val="clear" w:color="auto" w:fill="auto"/>
             <w:vAlign w:val="center"/>
           </w:tcPr>
           <w:p>
@@ -3744,7 +3778,6 @@
               <w:bottom w:val="single" w:sz="8" w:space="0" w:color="auto"/>
               <w:right w:val="single" w:sz="8" w:space="0" w:color="auto"/>
             </w:tcBorders>
-            <w:shd w:val="clear" w:color="auto" w:fill="auto"/>
             <w:vAlign w:val="center"/>
           </w:tcPr>
           <w:p>
@@ -3767,7 +3800,6 @@
               <w:bottom w:val="single" w:sz="8" w:space="0" w:color="auto"/>
               <w:right w:val="single" w:sz="8" w:space="0" w:color="auto"/>
             </w:tcBorders>
-            <w:shd w:val="clear" w:color="auto" w:fill="auto"/>
             <w:vAlign w:val="center"/>
           </w:tcPr>
           <w:p>
@@ -3790,7 +3822,6 @@
               <w:bottom w:val="single" w:sz="8" w:space="0" w:color="auto"/>
               <w:right w:val="single" w:sz="8" w:space="0" w:color="auto"/>
             </w:tcBorders>
-            <w:shd w:val="clear" w:color="auto" w:fill="auto"/>
             <w:vAlign w:val="center"/>
           </w:tcPr>
           <w:p>
@@ -3813,7 +3844,6 @@
               <w:bottom w:val="single" w:sz="8" w:space="0" w:color="auto"/>
               <w:right w:val="single" w:sz="8" w:space="0" w:color="auto"/>
             </w:tcBorders>
-            <w:shd w:val="clear" w:color="auto" w:fill="auto"/>
             <w:vAlign w:val="center"/>
           </w:tcPr>
           <w:p>
@@ -3836,7 +3866,6 @@
               <w:bottom w:val="single" w:sz="8" w:space="0" w:color="auto"/>
               <w:right w:val="single" w:sz="8" w:space="0" w:color="auto"/>
             </w:tcBorders>
-            <w:shd w:val="clear" w:color="auto" w:fill="auto"/>
             <w:vAlign w:val="center"/>
           </w:tcPr>
           <w:p>
@@ -3859,7 +3888,6 @@
               <w:bottom w:val="single" w:sz="8" w:space="0" w:color="auto"/>
               <w:right w:val="single" w:sz="8" w:space="0" w:color="auto"/>
             </w:tcBorders>
-            <w:shd w:val="clear" w:color="auto" w:fill="auto"/>
             <w:vAlign w:val="center"/>
           </w:tcPr>
           <w:p>
@@ -3887,7 +3915,6 @@
               <w:bottom w:val="single" w:sz="8" w:space="0" w:color="auto"/>
               <w:right w:val="single" w:sz="8" w:space="0" w:color="auto"/>
             </w:tcBorders>
-            <w:shd w:val="clear" w:color="auto" w:fill="auto"/>
             <w:vAlign w:val="center"/>
           </w:tcPr>
           <w:p>
@@ -3910,7 +3937,6 @@
               <w:bottom w:val="single" w:sz="8" w:space="0" w:color="auto"/>
               <w:right w:val="single" w:sz="8" w:space="0" w:color="auto"/>
             </w:tcBorders>
-            <w:shd w:val="clear" w:color="auto" w:fill="auto"/>
             <w:vAlign w:val="center"/>
           </w:tcPr>
           <w:p>
@@ -3933,7 +3959,6 @@
               <w:bottom w:val="single" w:sz="8" w:space="0" w:color="auto"/>
               <w:right w:val="single" w:sz="8" w:space="0" w:color="auto"/>
             </w:tcBorders>
-            <w:shd w:val="clear" w:color="auto" w:fill="auto"/>
             <w:vAlign w:val="center"/>
           </w:tcPr>
           <w:p>
@@ -3956,7 +3981,6 @@
               <w:bottom w:val="single" w:sz="8" w:space="0" w:color="auto"/>
               <w:right w:val="single" w:sz="8" w:space="0" w:color="auto"/>
             </w:tcBorders>
-            <w:shd w:val="clear" w:color="auto" w:fill="auto"/>
             <w:vAlign w:val="center"/>
           </w:tcPr>
           <w:p>
@@ -3979,7 +4003,6 @@
               <w:bottom w:val="single" w:sz="8" w:space="0" w:color="auto"/>
               <w:right w:val="single" w:sz="8" w:space="0" w:color="auto"/>
             </w:tcBorders>
-            <w:shd w:val="clear" w:color="auto" w:fill="auto"/>
             <w:vAlign w:val="center"/>
           </w:tcPr>
           <w:p>
@@ -4002,7 +4025,6 @@
               <w:bottom w:val="single" w:sz="8" w:space="0" w:color="auto"/>
               <w:right w:val="single" w:sz="8" w:space="0" w:color="auto"/>
             </w:tcBorders>
-            <w:shd w:val="clear" w:color="auto" w:fill="auto"/>
             <w:vAlign w:val="center"/>
           </w:tcPr>
           <w:p>
@@ -4025,7 +4047,6 @@
               <w:bottom w:val="single" w:sz="8" w:space="0" w:color="auto"/>
               <w:right w:val="single" w:sz="8" w:space="0" w:color="auto"/>
             </w:tcBorders>
-            <w:shd w:val="clear" w:color="auto" w:fill="auto"/>
             <w:vAlign w:val="center"/>
           </w:tcPr>
           <w:p>
@@ -4053,7 +4074,6 @@
               <w:bottom w:val="single" w:sz="8" w:space="0" w:color="auto"/>
               <w:right w:val="single" w:sz="8" w:space="0" w:color="auto"/>
             </w:tcBorders>
-            <w:shd w:val="clear" w:color="auto" w:fill="auto"/>
             <w:vAlign w:val="center"/>
           </w:tcPr>
           <w:p>
@@ -4076,7 +4096,6 @@
               <w:bottom w:val="single" w:sz="8" w:space="0" w:color="auto"/>
               <w:right w:val="single" w:sz="8" w:space="0" w:color="auto"/>
             </w:tcBorders>
-            <w:shd w:val="clear" w:color="auto" w:fill="auto"/>
             <w:vAlign w:val="center"/>
           </w:tcPr>
           <w:p>
@@ -4099,7 +4118,6 @@
               <w:bottom w:val="single" w:sz="8" w:space="0" w:color="auto"/>
               <w:right w:val="single" w:sz="8" w:space="0" w:color="auto"/>
             </w:tcBorders>
-            <w:shd w:val="clear" w:color="auto" w:fill="auto"/>
             <w:vAlign w:val="center"/>
           </w:tcPr>
           <w:p>
@@ -4122,7 +4140,6 @@
               <w:bottom w:val="single" w:sz="8" w:space="0" w:color="auto"/>
               <w:right w:val="single" w:sz="8" w:space="0" w:color="auto"/>
             </w:tcBorders>
-            <w:shd w:val="clear" w:color="auto" w:fill="auto"/>
             <w:vAlign w:val="center"/>
           </w:tcPr>
           <w:p>
@@ -4145,7 +4162,6 @@
               <w:bottom w:val="single" w:sz="8" w:space="0" w:color="auto"/>
               <w:right w:val="single" w:sz="8" w:space="0" w:color="auto"/>
             </w:tcBorders>
-            <w:shd w:val="clear" w:color="auto" w:fill="auto"/>
             <w:vAlign w:val="center"/>
           </w:tcPr>
           <w:p>
@@ -4168,7 +4184,6 @@
               <w:bottom w:val="single" w:sz="8" w:space="0" w:color="auto"/>
               <w:right w:val="single" w:sz="8" w:space="0" w:color="auto"/>
             </w:tcBorders>
-            <w:shd w:val="clear" w:color="auto" w:fill="auto"/>
             <w:vAlign w:val="center"/>
           </w:tcPr>
           <w:p>
@@ -4191,7 +4206,6 @@
               <w:bottom w:val="single" w:sz="8" w:space="0" w:color="auto"/>
               <w:right w:val="single" w:sz="8" w:space="0" w:color="auto"/>
             </w:tcBorders>
-            <w:shd w:val="clear" w:color="auto" w:fill="auto"/>
             <w:vAlign w:val="center"/>
           </w:tcPr>
           <w:p>
@@ -4219,7 +4233,6 @@
               <w:bottom w:val="single" w:sz="8" w:space="0" w:color="auto"/>
               <w:right w:val="single" w:sz="8" w:space="0" w:color="auto"/>
             </w:tcBorders>
-            <w:shd w:val="clear" w:color="auto" w:fill="auto"/>
             <w:vAlign w:val="center"/>
           </w:tcPr>
           <w:p>
@@ -4242,7 +4255,6 @@
               <w:bottom w:val="single" w:sz="8" w:space="0" w:color="auto"/>
               <w:right w:val="single" w:sz="8" w:space="0" w:color="auto"/>
             </w:tcBorders>
-            <w:shd w:val="clear" w:color="auto" w:fill="auto"/>
             <w:vAlign w:val="center"/>
           </w:tcPr>
           <w:p>
@@ -4265,7 +4277,6 @@
               <w:bottom w:val="single" w:sz="8" w:space="0" w:color="auto"/>
               <w:right w:val="single" w:sz="8" w:space="0" w:color="auto"/>
             </w:tcBorders>
-            <w:shd w:val="clear" w:color="auto" w:fill="auto"/>
             <w:vAlign w:val="center"/>
           </w:tcPr>
           <w:p>
@@ -4288,7 +4299,6 @@
               <w:bottom w:val="single" w:sz="8" w:space="0" w:color="auto"/>
               <w:right w:val="single" w:sz="8" w:space="0" w:color="auto"/>
             </w:tcBorders>
-            <w:shd w:val="clear" w:color="auto" w:fill="auto"/>
             <w:vAlign w:val="center"/>
           </w:tcPr>
           <w:p>
@@ -4311,7 +4321,6 @@
               <w:bottom w:val="single" w:sz="8" w:space="0" w:color="auto"/>
               <w:right w:val="single" w:sz="8" w:space="0" w:color="auto"/>
             </w:tcBorders>
-            <w:shd w:val="clear" w:color="auto" w:fill="auto"/>
             <w:vAlign w:val="center"/>
           </w:tcPr>
           <w:p>
@@ -4334,7 +4343,6 @@
               <w:bottom w:val="single" w:sz="8" w:space="0" w:color="auto"/>
               <w:right w:val="single" w:sz="8" w:space="0" w:color="auto"/>
             </w:tcBorders>
-            <w:shd w:val="clear" w:color="auto" w:fill="auto"/>
             <w:vAlign w:val="center"/>
           </w:tcPr>
           <w:p>
@@ -4357,7 +4365,6 @@
               <w:bottom w:val="single" w:sz="8" w:space="0" w:color="auto"/>
               <w:right w:val="single" w:sz="8" w:space="0" w:color="auto"/>
             </w:tcBorders>
-            <w:shd w:val="clear" w:color="auto" w:fill="auto"/>
             <w:vAlign w:val="center"/>
           </w:tcPr>
           <w:p>
@@ -4385,7 +4392,6 @@
               <w:bottom w:val="single" w:sz="8" w:space="0" w:color="auto"/>
               <w:right w:val="single" w:sz="8" w:space="0" w:color="auto"/>
             </w:tcBorders>
-            <w:shd w:val="clear" w:color="auto" w:fill="auto"/>
             <w:vAlign w:val="center"/>
           </w:tcPr>
           <w:p>
@@ -4408,7 +4414,6 @@
               <w:bottom w:val="single" w:sz="8" w:space="0" w:color="auto"/>
               <w:right w:val="single" w:sz="8" w:space="0" w:color="auto"/>
             </w:tcBorders>
-            <w:shd w:val="clear" w:color="auto" w:fill="auto"/>
             <w:vAlign w:val="center"/>
           </w:tcPr>
           <w:p>
@@ -4431,7 +4436,6 @@
               <w:bottom w:val="single" w:sz="8" w:space="0" w:color="auto"/>
               <w:right w:val="single" w:sz="8" w:space="0" w:color="auto"/>
             </w:tcBorders>
-            <w:shd w:val="clear" w:color="auto" w:fill="auto"/>
             <w:vAlign w:val="center"/>
           </w:tcPr>
           <w:p>
@@ -4454,7 +4458,6 @@
               <w:bottom w:val="single" w:sz="8" w:space="0" w:color="auto"/>
               <w:right w:val="single" w:sz="8" w:space="0" w:color="auto"/>
             </w:tcBorders>
-            <w:shd w:val="clear" w:color="auto" w:fill="auto"/>
             <w:vAlign w:val="center"/>
           </w:tcPr>
           <w:p>
@@ -4477,7 +4480,6 @@
               <w:bottom w:val="single" w:sz="8" w:space="0" w:color="auto"/>
               <w:right w:val="single" w:sz="8" w:space="0" w:color="auto"/>
             </w:tcBorders>
-            <w:shd w:val="clear" w:color="auto" w:fill="auto"/>
             <w:vAlign w:val="center"/>
           </w:tcPr>
           <w:p>
@@ -4500,7 +4502,6 @@
               <w:bottom w:val="single" w:sz="8" w:space="0" w:color="auto"/>
               <w:right w:val="single" w:sz="8" w:space="0" w:color="auto"/>
             </w:tcBorders>
-            <w:shd w:val="clear" w:color="auto" w:fill="auto"/>
             <w:vAlign w:val="center"/>
           </w:tcPr>
           <w:p>
@@ -4523,7 +4524,6 @@
               <w:bottom w:val="single" w:sz="8" w:space="0" w:color="auto"/>
               <w:right w:val="single" w:sz="8" w:space="0" w:color="auto"/>
             </w:tcBorders>
-            <w:shd w:val="clear" w:color="auto" w:fill="auto"/>
             <w:vAlign w:val="center"/>
           </w:tcPr>
           <w:p>
@@ -4551,7 +4551,6 @@
               <w:bottom w:val="single" w:sz="8" w:space="0" w:color="auto"/>
               <w:right w:val="single" w:sz="8" w:space="0" w:color="auto"/>
             </w:tcBorders>
-            <w:shd w:val="clear" w:color="auto" w:fill="auto"/>
             <w:vAlign w:val="center"/>
           </w:tcPr>
           <w:p>
@@ -4574,7 +4573,6 @@
               <w:bottom w:val="single" w:sz="8" w:space="0" w:color="auto"/>
               <w:right w:val="single" w:sz="8" w:space="0" w:color="auto"/>
             </w:tcBorders>
-            <w:shd w:val="clear" w:color="auto" w:fill="auto"/>
             <w:vAlign w:val="center"/>
           </w:tcPr>
           <w:p>
@@ -4597,7 +4595,6 @@
               <w:bottom w:val="single" w:sz="8" w:space="0" w:color="auto"/>
               <w:right w:val="single" w:sz="8" w:space="0" w:color="auto"/>
             </w:tcBorders>
-            <w:shd w:val="clear" w:color="auto" w:fill="auto"/>
             <w:vAlign w:val="center"/>
           </w:tcPr>
           <w:p>
@@ -4620,7 +4617,6 @@
               <w:bottom w:val="single" w:sz="8" w:space="0" w:color="auto"/>
               <w:right w:val="single" w:sz="8" w:space="0" w:color="auto"/>
             </w:tcBorders>
-            <w:shd w:val="clear" w:color="auto" w:fill="auto"/>
             <w:vAlign w:val="center"/>
           </w:tcPr>
           <w:p>
@@ -4643,7 +4639,6 @@
               <w:bottom w:val="single" w:sz="8" w:space="0" w:color="auto"/>
               <w:right w:val="single" w:sz="8" w:space="0" w:color="auto"/>
             </w:tcBorders>
-            <w:shd w:val="clear" w:color="auto" w:fill="auto"/>
             <w:vAlign w:val="center"/>
           </w:tcPr>
           <w:p>
@@ -4666,7 +4661,6 @@
               <w:bottom w:val="single" w:sz="8" w:space="0" w:color="auto"/>
               <w:right w:val="single" w:sz="8" w:space="0" w:color="auto"/>
             </w:tcBorders>
-            <w:shd w:val="clear" w:color="auto" w:fill="auto"/>
             <w:vAlign w:val="center"/>
           </w:tcPr>
           <w:p>
@@ -4689,7 +4683,6 @@
               <w:bottom w:val="single" w:sz="8" w:space="0" w:color="auto"/>
               <w:right w:val="single" w:sz="8" w:space="0" w:color="auto"/>
             </w:tcBorders>
-            <w:shd w:val="clear" w:color="auto" w:fill="auto"/>
             <w:vAlign w:val="center"/>
           </w:tcPr>
           <w:p>
@@ -4717,7 +4710,6 @@
               <w:bottom w:val="single" w:sz="8" w:space="0" w:color="auto"/>
               <w:right w:val="single" w:sz="8" w:space="0" w:color="auto"/>
             </w:tcBorders>
-            <w:shd w:val="clear" w:color="auto" w:fill="auto"/>
             <w:vAlign w:val="center"/>
           </w:tcPr>
           <w:p>
@@ -4740,7 +4732,6 @@
               <w:bottom w:val="single" w:sz="8" w:space="0" w:color="auto"/>
               <w:right w:val="single" w:sz="8" w:space="0" w:color="auto"/>
             </w:tcBorders>
-            <w:shd w:val="clear" w:color="auto" w:fill="auto"/>
             <w:vAlign w:val="center"/>
           </w:tcPr>
           <w:p>
@@ -4763,7 +4754,6 @@
               <w:bottom w:val="single" w:sz="8" w:space="0" w:color="auto"/>
               <w:right w:val="single" w:sz="8" w:space="0" w:color="auto"/>
             </w:tcBorders>
-            <w:shd w:val="clear" w:color="auto" w:fill="auto"/>
             <w:vAlign w:val="center"/>
           </w:tcPr>
           <w:p>
@@ -4786,7 +4776,6 @@
               <w:bottom w:val="single" w:sz="8" w:space="0" w:color="auto"/>
               <w:right w:val="single" w:sz="8" w:space="0" w:color="auto"/>
             </w:tcBorders>
-            <w:shd w:val="clear" w:color="auto" w:fill="auto"/>
             <w:vAlign w:val="center"/>
           </w:tcPr>
           <w:p>
@@ -4809,7 +4798,6 @@
               <w:bottom w:val="single" w:sz="8" w:space="0" w:color="auto"/>
               <w:right w:val="single" w:sz="8" w:space="0" w:color="auto"/>
             </w:tcBorders>
-            <w:shd w:val="clear" w:color="auto" w:fill="auto"/>
             <w:vAlign w:val="center"/>
           </w:tcPr>
           <w:p>
@@ -4832,7 +4820,6 @@
               <w:bottom w:val="single" w:sz="8" w:space="0" w:color="auto"/>
               <w:right w:val="single" w:sz="8" w:space="0" w:color="auto"/>
             </w:tcBorders>
-            <w:shd w:val="clear" w:color="auto" w:fill="auto"/>
             <w:vAlign w:val="center"/>
           </w:tcPr>
           <w:p>
@@ -4855,7 +4842,6 @@
               <w:bottom w:val="single" w:sz="8" w:space="0" w:color="auto"/>
               <w:right w:val="single" w:sz="8" w:space="0" w:color="auto"/>
             </w:tcBorders>
-            <w:shd w:val="clear" w:color="auto" w:fill="auto"/>
             <w:vAlign w:val="center"/>
           </w:tcPr>
           <w:p>
@@ -4883,7 +4869,6 @@
               <w:bottom w:val="single" w:sz="8" w:space="0" w:color="auto"/>
               <w:right w:val="single" w:sz="8" w:space="0" w:color="auto"/>
             </w:tcBorders>
-            <w:shd w:val="clear" w:color="auto" w:fill="auto"/>
             <w:vAlign w:val="center"/>
           </w:tcPr>
           <w:p>
@@ -4906,7 +4891,6 @@
               <w:bottom w:val="single" w:sz="8" w:space="0" w:color="auto"/>
               <w:right w:val="single" w:sz="8" w:space="0" w:color="auto"/>
             </w:tcBorders>
-            <w:shd w:val="clear" w:color="auto" w:fill="auto"/>
             <w:vAlign w:val="center"/>
           </w:tcPr>
           <w:p>
@@ -4929,7 +4913,6 @@
               <w:bottom w:val="single" w:sz="8" w:space="0" w:color="auto"/>
               <w:right w:val="single" w:sz="8" w:space="0" w:color="auto"/>
             </w:tcBorders>
-            <w:shd w:val="clear" w:color="auto" w:fill="auto"/>
             <w:vAlign w:val="center"/>
           </w:tcPr>
           <w:p>
@@ -4952,7 +4935,6 @@
               <w:bottom w:val="single" w:sz="8" w:space="0" w:color="auto"/>
               <w:right w:val="single" w:sz="8" w:space="0" w:color="auto"/>
             </w:tcBorders>
-            <w:shd w:val="clear" w:color="auto" w:fill="auto"/>
             <w:vAlign w:val="center"/>
           </w:tcPr>
           <w:p>
@@ -4975,7 +4957,6 @@
               <w:bottom w:val="single" w:sz="8" w:space="0" w:color="auto"/>
               <w:right w:val="single" w:sz="8" w:space="0" w:color="auto"/>
             </w:tcBorders>
-            <w:shd w:val="clear" w:color="auto" w:fill="auto"/>
             <w:vAlign w:val="center"/>
           </w:tcPr>
           <w:p>
@@ -4998,7 +4979,6 @@
               <w:bottom w:val="single" w:sz="8" w:space="0" w:color="auto"/>
               <w:right w:val="single" w:sz="8" w:space="0" w:color="auto"/>
             </w:tcBorders>
-            <w:shd w:val="clear" w:color="auto" w:fill="auto"/>
             <w:vAlign w:val="center"/>
           </w:tcPr>
           <w:p>
@@ -5021,7 +5001,6 @@
               <w:bottom w:val="single" w:sz="8" w:space="0" w:color="auto"/>
               <w:right w:val="single" w:sz="8" w:space="0" w:color="auto"/>
             </w:tcBorders>
-            <w:shd w:val="clear" w:color="auto" w:fill="auto"/>
             <w:vAlign w:val="center"/>
           </w:tcPr>
           <w:p>
@@ -5049,7 +5028,6 @@
               <w:bottom w:val="single" w:sz="8" w:space="0" w:color="auto"/>
               <w:right w:val="single" w:sz="8" w:space="0" w:color="auto"/>
             </w:tcBorders>
-            <w:shd w:val="clear" w:color="auto" w:fill="auto"/>
             <w:vAlign w:val="center"/>
           </w:tcPr>
           <w:p>
@@ -5072,7 +5050,6 @@
               <w:bottom w:val="single" w:sz="8" w:space="0" w:color="auto"/>
               <w:right w:val="single" w:sz="8" w:space="0" w:color="auto"/>
             </w:tcBorders>
-            <w:shd w:val="clear" w:color="auto" w:fill="auto"/>
             <w:vAlign w:val="center"/>
           </w:tcPr>
           <w:p>
@@ -5095,7 +5072,6 @@
               <w:bottom w:val="single" w:sz="8" w:space="0" w:color="auto"/>
               <w:right w:val="single" w:sz="8" w:space="0" w:color="auto"/>
             </w:tcBorders>
-            <w:shd w:val="clear" w:color="auto" w:fill="auto"/>
             <w:vAlign w:val="center"/>
           </w:tcPr>
           <w:p>
@@ -5118,7 +5094,6 @@
               <w:bottom w:val="single" w:sz="8" w:space="0" w:color="auto"/>
               <w:right w:val="single" w:sz="8" w:space="0" w:color="auto"/>
             </w:tcBorders>
-            <w:shd w:val="clear" w:color="auto" w:fill="auto"/>
             <w:vAlign w:val="center"/>
           </w:tcPr>
           <w:p>
@@ -5141,7 +5116,6 @@
               <w:bottom w:val="single" w:sz="8" w:space="0" w:color="auto"/>
               <w:right w:val="single" w:sz="8" w:space="0" w:color="auto"/>
             </w:tcBorders>
-            <w:shd w:val="clear" w:color="auto" w:fill="auto"/>
             <w:vAlign w:val="center"/>
           </w:tcPr>
           <w:p>
@@ -5164,7 +5138,6 @@
               <w:bottom w:val="single" w:sz="8" w:space="0" w:color="auto"/>
               <w:right w:val="single" w:sz="8" w:space="0" w:color="auto"/>
             </w:tcBorders>
-            <w:shd w:val="clear" w:color="auto" w:fill="auto"/>
             <w:vAlign w:val="center"/>
           </w:tcPr>
           <w:p>
@@ -5187,7 +5160,6 @@
               <w:bottom w:val="single" w:sz="8" w:space="0" w:color="auto"/>
               <w:right w:val="single" w:sz="8" w:space="0" w:color="auto"/>
             </w:tcBorders>
-            <w:shd w:val="clear" w:color="auto" w:fill="auto"/>
             <w:vAlign w:val="center"/>
           </w:tcPr>
           <w:p>
@@ -5215,7 +5187,6 @@
               <w:bottom w:val="single" w:sz="8" w:space="0" w:color="auto"/>
               <w:right w:val="single" w:sz="8" w:space="0" w:color="auto"/>
             </w:tcBorders>
-            <w:shd w:val="clear" w:color="auto" w:fill="auto"/>
             <w:vAlign w:val="center"/>
           </w:tcPr>
           <w:p>
@@ -5246,7 +5217,6 @@
               <w:bottom w:val="single" w:sz="8" w:space="0" w:color="auto"/>
               <w:right w:val="single" w:sz="8" w:space="0" w:color="auto"/>
             </w:tcBorders>
-            <w:shd w:val="clear" w:color="auto" w:fill="auto"/>
             <w:vAlign w:val="center"/>
           </w:tcPr>
           <w:p>
@@ -5277,7 +5247,6 @@
               <w:bottom w:val="single" w:sz="8" w:space="0" w:color="auto"/>
               <w:right w:val="single" w:sz="8" w:space="0" w:color="auto"/>
             </w:tcBorders>
-            <w:shd w:val="clear" w:color="auto" w:fill="auto"/>
             <w:vAlign w:val="center"/>
           </w:tcPr>
           <w:p>
@@ -5324,7 +5293,6 @@
               <w:bottom w:val="single" w:sz="8" w:space="0" w:color="auto"/>
               <w:right w:val="single" w:sz="8" w:space="0" w:color="auto"/>
             </w:tcBorders>
-            <w:shd w:val="clear" w:color="auto" w:fill="auto"/>
             <w:vAlign w:val="center"/>
           </w:tcPr>
           <w:p>
@@ -5377,7 +5345,6 @@
               <w:bottom w:val="single" w:sz="8" w:space="0" w:color="auto"/>
               <w:right w:val="single" w:sz="8" w:space="0" w:color="auto"/>
             </w:tcBorders>
-            <w:shd w:val="clear" w:color="auto" w:fill="auto"/>
             <w:vAlign w:val="center"/>
           </w:tcPr>
           <w:p>
@@ -5408,7 +5375,6 @@
               <w:bottom w:val="single" w:sz="8" w:space="0" w:color="auto"/>
               <w:right w:val="single" w:sz="8" w:space="0" w:color="auto"/>
             </w:tcBorders>
-            <w:shd w:val="clear" w:color="auto" w:fill="auto"/>
             <w:vAlign w:val="center"/>
           </w:tcPr>
           <w:p>
@@ -5446,7 +5412,6 @@
               <w:bottom w:val="single" w:sz="8" w:space="0" w:color="auto"/>
               <w:right w:val="single" w:sz="8" w:space="0" w:color="auto"/>
             </w:tcBorders>
-            <w:shd w:val="clear" w:color="auto" w:fill="auto"/>
             <w:vAlign w:val="center"/>
           </w:tcPr>
           <w:p>
@@ -5487,13 +5452,21 @@
         </w:r>
       </w:fldSimple>
       <w:r>
-        <w:t>: Summary of Assessment Recommendations</w:t>
+        <w:t xml:space="preserve">: Summary of Assessment </w:t>
+      </w:r>
+      <w:proofErr w:type="gramStart"/>
+      <w:r>
+        <w:t>Recommendations</w:t>
       </w:r>
       <w:r>
         <w:t>.</w:t>
       </w:r>
       <w:r>
-        <w:t>&lt;A</w:t>
+        <w:t>&lt;</w:t>
+      </w:r>
+      <w:proofErr w:type="gramEnd"/>
+      <w:r>
+        <w:t>A</w:t>
       </w:r>
       <w:r>
         <w:t>DD</w:t>
@@ -5742,7 +5715,6 @@
               <w:bottom w:val="single" w:sz="8" w:space="0" w:color="auto"/>
               <w:right w:val="single" w:sz="8" w:space="0" w:color="auto"/>
             </w:tcBorders>
-            <w:shd w:val="clear" w:color="auto" w:fill="auto"/>
             <w:vAlign w:val="center"/>
           </w:tcPr>
           <w:p>
@@ -5765,7 +5737,6 @@
               <w:bottom w:val="single" w:sz="8" w:space="0" w:color="auto"/>
               <w:right w:val="single" w:sz="8" w:space="0" w:color="auto"/>
             </w:tcBorders>
-            <w:shd w:val="clear" w:color="auto" w:fill="auto"/>
             <w:vAlign w:val="center"/>
           </w:tcPr>
           <w:p>
@@ -5788,7 +5759,6 @@
               <w:bottom w:val="single" w:sz="8" w:space="0" w:color="auto"/>
               <w:right w:val="single" w:sz="8" w:space="0" w:color="auto"/>
             </w:tcBorders>
-            <w:shd w:val="clear" w:color="auto" w:fill="auto"/>
             <w:vAlign w:val="center"/>
           </w:tcPr>
           <w:p>
@@ -5811,7 +5781,6 @@
               <w:bottom w:val="single" w:sz="8" w:space="0" w:color="auto"/>
               <w:right w:val="single" w:sz="8" w:space="0" w:color="auto"/>
             </w:tcBorders>
-            <w:shd w:val="clear" w:color="auto" w:fill="auto"/>
             <w:vAlign w:val="center"/>
           </w:tcPr>
           <w:p>
@@ -5834,7 +5803,6 @@
               <w:bottom w:val="single" w:sz="8" w:space="0" w:color="auto"/>
               <w:right w:val="single" w:sz="8" w:space="0" w:color="auto"/>
             </w:tcBorders>
-            <w:shd w:val="clear" w:color="auto" w:fill="auto"/>
             <w:vAlign w:val="center"/>
           </w:tcPr>
           <w:p>
@@ -5857,7 +5825,6 @@
               <w:bottom w:val="single" w:sz="8" w:space="0" w:color="auto"/>
               <w:right w:val="single" w:sz="8" w:space="0" w:color="auto"/>
             </w:tcBorders>
-            <w:shd w:val="clear" w:color="auto" w:fill="auto"/>
             <w:vAlign w:val="center"/>
           </w:tcPr>
           <w:p>
@@ -5880,7 +5847,6 @@
               <w:bottom w:val="single" w:sz="8" w:space="0" w:color="auto"/>
               <w:right w:val="single" w:sz="8" w:space="0" w:color="auto"/>
             </w:tcBorders>
-            <w:shd w:val="clear" w:color="auto" w:fill="auto"/>
             <w:vAlign w:val="center"/>
           </w:tcPr>
           <w:p>
@@ -5908,7 +5874,6 @@
               <w:bottom w:val="single" w:sz="8" w:space="0" w:color="auto"/>
               <w:right w:val="single" w:sz="8" w:space="0" w:color="auto"/>
             </w:tcBorders>
-            <w:shd w:val="clear" w:color="auto" w:fill="auto"/>
             <w:vAlign w:val="center"/>
           </w:tcPr>
           <w:p>
@@ -5931,7 +5896,6 @@
               <w:bottom w:val="single" w:sz="8" w:space="0" w:color="auto"/>
               <w:right w:val="single" w:sz="8" w:space="0" w:color="auto"/>
             </w:tcBorders>
-            <w:shd w:val="clear" w:color="auto" w:fill="auto"/>
             <w:vAlign w:val="center"/>
           </w:tcPr>
           <w:p>
@@ -5954,7 +5918,6 @@
               <w:bottom w:val="single" w:sz="8" w:space="0" w:color="auto"/>
               <w:right w:val="single" w:sz="8" w:space="0" w:color="auto"/>
             </w:tcBorders>
-            <w:shd w:val="clear" w:color="auto" w:fill="auto"/>
             <w:vAlign w:val="center"/>
           </w:tcPr>
           <w:p>
@@ -5977,7 +5940,6 @@
               <w:bottom w:val="single" w:sz="8" w:space="0" w:color="auto"/>
               <w:right w:val="single" w:sz="8" w:space="0" w:color="auto"/>
             </w:tcBorders>
-            <w:shd w:val="clear" w:color="auto" w:fill="auto"/>
             <w:vAlign w:val="center"/>
           </w:tcPr>
           <w:p>
@@ -6000,7 +5962,6 @@
               <w:bottom w:val="single" w:sz="8" w:space="0" w:color="auto"/>
               <w:right w:val="single" w:sz="8" w:space="0" w:color="auto"/>
             </w:tcBorders>
-            <w:shd w:val="clear" w:color="auto" w:fill="auto"/>
             <w:vAlign w:val="center"/>
           </w:tcPr>
           <w:p>
@@ -6023,7 +5984,6 @@
               <w:bottom w:val="single" w:sz="8" w:space="0" w:color="auto"/>
               <w:right w:val="single" w:sz="8" w:space="0" w:color="auto"/>
             </w:tcBorders>
-            <w:shd w:val="clear" w:color="auto" w:fill="auto"/>
             <w:vAlign w:val="center"/>
           </w:tcPr>
           <w:p>
@@ -6046,7 +6006,6 @@
               <w:bottom w:val="single" w:sz="8" w:space="0" w:color="auto"/>
               <w:right w:val="single" w:sz="8" w:space="0" w:color="auto"/>
             </w:tcBorders>
-            <w:shd w:val="clear" w:color="auto" w:fill="auto"/>
             <w:vAlign w:val="center"/>
           </w:tcPr>
           <w:p>
@@ -6074,7 +6033,6 @@
               <w:bottom w:val="single" w:sz="8" w:space="0" w:color="auto"/>
               <w:right w:val="single" w:sz="8" w:space="0" w:color="auto"/>
             </w:tcBorders>
-            <w:shd w:val="clear" w:color="auto" w:fill="auto"/>
             <w:vAlign w:val="center"/>
           </w:tcPr>
           <w:p>
@@ -6097,7 +6055,6 @@
               <w:bottom w:val="single" w:sz="8" w:space="0" w:color="auto"/>
               <w:right w:val="single" w:sz="8" w:space="0" w:color="auto"/>
             </w:tcBorders>
-            <w:shd w:val="clear" w:color="auto" w:fill="auto"/>
             <w:vAlign w:val="center"/>
           </w:tcPr>
           <w:p>
@@ -6120,7 +6077,6 @@
               <w:bottom w:val="single" w:sz="8" w:space="0" w:color="auto"/>
               <w:right w:val="single" w:sz="8" w:space="0" w:color="auto"/>
             </w:tcBorders>
-            <w:shd w:val="clear" w:color="auto" w:fill="auto"/>
             <w:vAlign w:val="center"/>
           </w:tcPr>
           <w:p>
@@ -6143,7 +6099,6 @@
               <w:bottom w:val="single" w:sz="8" w:space="0" w:color="auto"/>
               <w:right w:val="single" w:sz="8" w:space="0" w:color="auto"/>
             </w:tcBorders>
-            <w:shd w:val="clear" w:color="auto" w:fill="auto"/>
             <w:vAlign w:val="center"/>
           </w:tcPr>
           <w:p>
@@ -6166,7 +6121,6 @@
               <w:bottom w:val="single" w:sz="8" w:space="0" w:color="auto"/>
               <w:right w:val="single" w:sz="8" w:space="0" w:color="auto"/>
             </w:tcBorders>
-            <w:shd w:val="clear" w:color="auto" w:fill="auto"/>
             <w:vAlign w:val="center"/>
           </w:tcPr>
           <w:p>
@@ -6189,7 +6143,6 @@
               <w:bottom w:val="single" w:sz="8" w:space="0" w:color="auto"/>
               <w:right w:val="single" w:sz="8" w:space="0" w:color="auto"/>
             </w:tcBorders>
-            <w:shd w:val="clear" w:color="auto" w:fill="auto"/>
             <w:vAlign w:val="center"/>
           </w:tcPr>
           <w:p>
@@ -6212,7 +6165,6 @@
               <w:bottom w:val="single" w:sz="8" w:space="0" w:color="auto"/>
               <w:right w:val="single" w:sz="8" w:space="0" w:color="auto"/>
             </w:tcBorders>
-            <w:shd w:val="clear" w:color="auto" w:fill="auto"/>
             <w:vAlign w:val="center"/>
           </w:tcPr>
           <w:p>
@@ -6240,7 +6192,6 @@
               <w:bottom w:val="single" w:sz="8" w:space="0" w:color="auto"/>
               <w:right w:val="single" w:sz="8" w:space="0" w:color="auto"/>
             </w:tcBorders>
-            <w:shd w:val="clear" w:color="auto" w:fill="auto"/>
             <w:vAlign w:val="center"/>
           </w:tcPr>
           <w:p>
@@ -6263,7 +6214,6 @@
               <w:bottom w:val="single" w:sz="8" w:space="0" w:color="auto"/>
               <w:right w:val="single" w:sz="8" w:space="0" w:color="auto"/>
             </w:tcBorders>
-            <w:shd w:val="clear" w:color="auto" w:fill="auto"/>
             <w:vAlign w:val="center"/>
           </w:tcPr>
           <w:p>
@@ -6286,7 +6236,6 @@
               <w:bottom w:val="single" w:sz="8" w:space="0" w:color="auto"/>
               <w:right w:val="single" w:sz="8" w:space="0" w:color="auto"/>
             </w:tcBorders>
-            <w:shd w:val="clear" w:color="auto" w:fill="auto"/>
             <w:vAlign w:val="center"/>
           </w:tcPr>
           <w:p>
@@ -6309,7 +6258,6 @@
               <w:bottom w:val="single" w:sz="8" w:space="0" w:color="auto"/>
               <w:right w:val="single" w:sz="8" w:space="0" w:color="auto"/>
             </w:tcBorders>
-            <w:shd w:val="clear" w:color="auto" w:fill="auto"/>
             <w:vAlign w:val="center"/>
           </w:tcPr>
           <w:p>
@@ -6332,7 +6280,6 @@
               <w:bottom w:val="single" w:sz="8" w:space="0" w:color="auto"/>
               <w:right w:val="single" w:sz="8" w:space="0" w:color="auto"/>
             </w:tcBorders>
-            <w:shd w:val="clear" w:color="auto" w:fill="auto"/>
             <w:vAlign w:val="center"/>
           </w:tcPr>
           <w:p>
@@ -6355,7 +6302,6 @@
               <w:bottom w:val="single" w:sz="8" w:space="0" w:color="auto"/>
               <w:right w:val="single" w:sz="8" w:space="0" w:color="auto"/>
             </w:tcBorders>
-            <w:shd w:val="clear" w:color="auto" w:fill="auto"/>
             <w:vAlign w:val="center"/>
           </w:tcPr>
           <w:p>
@@ -6378,7 +6324,6 @@
               <w:bottom w:val="single" w:sz="8" w:space="0" w:color="auto"/>
               <w:right w:val="single" w:sz="8" w:space="0" w:color="auto"/>
             </w:tcBorders>
-            <w:shd w:val="clear" w:color="auto" w:fill="auto"/>
             <w:vAlign w:val="center"/>
           </w:tcPr>
           <w:p>
@@ -6406,7 +6351,6 @@
               <w:bottom w:val="single" w:sz="8" w:space="0" w:color="auto"/>
               <w:right w:val="single" w:sz="8" w:space="0" w:color="auto"/>
             </w:tcBorders>
-            <w:shd w:val="clear" w:color="auto" w:fill="auto"/>
             <w:vAlign w:val="center"/>
           </w:tcPr>
           <w:p>
@@ -6429,7 +6373,6 @@
               <w:bottom w:val="single" w:sz="8" w:space="0" w:color="auto"/>
               <w:right w:val="single" w:sz="8" w:space="0" w:color="auto"/>
             </w:tcBorders>
-            <w:shd w:val="clear" w:color="auto" w:fill="auto"/>
             <w:vAlign w:val="center"/>
           </w:tcPr>
           <w:p>
@@ -6452,7 +6395,6 @@
               <w:bottom w:val="single" w:sz="8" w:space="0" w:color="auto"/>
               <w:right w:val="single" w:sz="8" w:space="0" w:color="auto"/>
             </w:tcBorders>
-            <w:shd w:val="clear" w:color="auto" w:fill="auto"/>
             <w:vAlign w:val="center"/>
           </w:tcPr>
           <w:p>
@@ -6475,7 +6417,6 @@
               <w:bottom w:val="single" w:sz="8" w:space="0" w:color="auto"/>
               <w:right w:val="single" w:sz="8" w:space="0" w:color="auto"/>
             </w:tcBorders>
-            <w:shd w:val="clear" w:color="auto" w:fill="auto"/>
             <w:vAlign w:val="center"/>
           </w:tcPr>
           <w:p>
@@ -6498,7 +6439,6 @@
               <w:bottom w:val="single" w:sz="8" w:space="0" w:color="auto"/>
               <w:right w:val="single" w:sz="8" w:space="0" w:color="auto"/>
             </w:tcBorders>
-            <w:shd w:val="clear" w:color="auto" w:fill="auto"/>
             <w:vAlign w:val="center"/>
           </w:tcPr>
           <w:p>
@@ -6521,7 +6461,6 @@
               <w:bottom w:val="single" w:sz="8" w:space="0" w:color="auto"/>
               <w:right w:val="single" w:sz="8" w:space="0" w:color="auto"/>
             </w:tcBorders>
-            <w:shd w:val="clear" w:color="auto" w:fill="auto"/>
             <w:vAlign w:val="center"/>
           </w:tcPr>
           <w:p>
@@ -6544,7 +6483,6 @@
               <w:bottom w:val="single" w:sz="8" w:space="0" w:color="auto"/>
               <w:right w:val="single" w:sz="8" w:space="0" w:color="auto"/>
             </w:tcBorders>
-            <w:shd w:val="clear" w:color="auto" w:fill="auto"/>
             <w:vAlign w:val="center"/>
           </w:tcPr>
           <w:p>
@@ -6572,7 +6510,6 @@
               <w:bottom w:val="single" w:sz="8" w:space="0" w:color="auto"/>
               <w:right w:val="single" w:sz="8" w:space="0" w:color="auto"/>
             </w:tcBorders>
-            <w:shd w:val="clear" w:color="auto" w:fill="auto"/>
             <w:vAlign w:val="center"/>
           </w:tcPr>
           <w:p>
@@ -6603,7 +6540,6 @@
               <w:bottom w:val="single" w:sz="8" w:space="0" w:color="auto"/>
               <w:right w:val="single" w:sz="8" w:space="0" w:color="auto"/>
             </w:tcBorders>
-            <w:shd w:val="clear" w:color="auto" w:fill="auto"/>
             <w:vAlign w:val="center"/>
           </w:tcPr>
           <w:p>
@@ -6634,7 +6570,6 @@
               <w:bottom w:val="single" w:sz="8" w:space="0" w:color="auto"/>
               <w:right w:val="single" w:sz="8" w:space="0" w:color="auto"/>
             </w:tcBorders>
-            <w:shd w:val="clear" w:color="auto" w:fill="auto"/>
             <w:vAlign w:val="center"/>
           </w:tcPr>
           <w:p>
@@ -6665,7 +6600,6 @@
               <w:bottom w:val="single" w:sz="8" w:space="0" w:color="auto"/>
               <w:right w:val="single" w:sz="8" w:space="0" w:color="auto"/>
             </w:tcBorders>
-            <w:shd w:val="clear" w:color="auto" w:fill="auto"/>
             <w:vAlign w:val="center"/>
           </w:tcPr>
           <w:p>
@@ -6726,7 +6660,6 @@
               <w:bottom w:val="single" w:sz="8" w:space="0" w:color="auto"/>
               <w:right w:val="single" w:sz="8" w:space="0" w:color="auto"/>
             </w:tcBorders>
-            <w:shd w:val="clear" w:color="auto" w:fill="auto"/>
             <w:vAlign w:val="center"/>
           </w:tcPr>
           <w:p>
@@ -6787,7 +6720,6 @@
               <w:bottom w:val="single" w:sz="8" w:space="0" w:color="auto"/>
               <w:right w:val="single" w:sz="8" w:space="0" w:color="auto"/>
             </w:tcBorders>
-            <w:shd w:val="clear" w:color="auto" w:fill="auto"/>
             <w:vAlign w:val="center"/>
           </w:tcPr>
           <w:p>
@@ -6848,7 +6780,6 @@
               <w:bottom w:val="single" w:sz="8" w:space="0" w:color="auto"/>
               <w:right w:val="single" w:sz="8" w:space="0" w:color="auto"/>
             </w:tcBorders>
-            <w:shd w:val="clear" w:color="auto" w:fill="auto"/>
             <w:vAlign w:val="center"/>
           </w:tcPr>
           <w:p>
@@ -6917,10 +6848,18 @@
         </w:r>
       </w:fldSimple>
       <w:r>
-        <w:t>: Summary of Additional Assessment Recommendations.</w:t>
-      </w:r>
-      <w:r>
-        <w:t>&lt;/A</w:t>
+        <w:t xml:space="preserve">: Summary of Additional Assessment </w:t>
+      </w:r>
+      <w:proofErr w:type="gramStart"/>
+      <w:r>
+        <w:t>Recommendations.</w:t>
+      </w:r>
+      <w:r>
+        <w:t>&lt;</w:t>
+      </w:r>
+      <w:proofErr w:type="gramEnd"/>
+      <w:r>
+        <w:t>/A</w:t>
       </w:r>
       <w:r>
         <w:t>DD</w:t>
@@ -6934,7 +6873,7 @@
       <w:bookmarkEnd w:id="17"/>
     </w:p>
     <w:sectPr>
-      <w:footerReference w:type="default" r:id="rId13"/>
+      <w:footerReference w:type="default" r:id="rId12"/>
       <w:pgSz w:w="12240" w:h="15840"/>
       <w:pgMar w:top="1440" w:right="1440" w:bottom="1440" w:left="1440" w:header="720" w:footer="720" w:gutter="0"/>
       <w:pgNumType w:start="1"/>

</xml_diff>